<commit_message>
Fix naming: GABORA is the water plan area, not the tool's name
GABORA = Great Artesian Basin and Other Regional Aquifers water plan
area. The PoC overview and CLAUDE.md no longer present it as the tool's
name; the tool is described generically and GABORA is expanded at first
use as the plan area.

Co-Authored-By: Claude Fable 5 <noreply@anthropic.com>
</commit_message>
<xml_diff>
--- a/docs/gabora-poc-overview-draft.docx
+++ b/docs/gabora-poc-overview-draft.docx
@@ -13,7 +13,7 @@
           <w:color w:val="1F3864"/>
           <w:sz w:val="36"/>
         </w:rPr>
-        <w:t>GABORA: a proof-of-concept tool for cumulative impact assessment of water licence applications in the Surat Basin</w:t>
+        <w:t>A proof-of-concept tool for cumulative impact assessment of water licence applications in the GABORA water plan area</w:t>
       </w:r>
     </w:p>
     <w:p>
@@ -176,7 +176,7 @@
         <w:rPr>
           <w:sz w:val="18"/>
         </w:rPr>
-        <w:t>Citation: Schoning, G (2026), GABORA: a proof-of-concept tool for cumulative impact assessment of water licence applications in the Surat Basin. A proof-of-concept overview, Department of Local Government, Water and Volunteers, Queensland Government, Australia. July 2026.</w:t>
+        <w:t>Citation: Schoning, G (2026), A proof-of-concept tool for cumulative impact assessment of water licence applications in the GABORA water plan area. A proof-of-concept overview, Department of Local Government, Water and Volunteers, Queensland Government, Australia. July 2026.</w:t>
       </w:r>
     </w:p>
     <w:p>
@@ -256,7 +256,7 @@
         <w:spacing w:after="120"/>
       </w:pPr>
       <w:r>
-        <w:t>This paper describes a proof-of-concept decision-support tool, GABORA, that predicts the drawdown impact of a proposed bore or licence trade at every spring complex and neighbouring water bore, separates that impact from the impact of currently approved extraction, and compares the result against a regulatory trigger threshold at 10, 50 and 100 years. The paper outlines the approach (section 3), the delivered proof of concept (section 4), its verification (section 5), and its current limitations and suggested next steps (sections 6 and 7).</w:t>
+        <w:t>This paper describes a proof-of-concept decision-support tool for assessing water licence applications in aquifers of the Great Artesian Basin and other regional aquifers (GABORA) water plan area. The tool predicts the drawdown impact of a proposed bore or licence trade at every spring complex and neighbouring water bore, separates that impact from the impact of currently approved extraction, and compares the result against a regulatory trigger threshold at 10, 50 and 100 years. The paper outlines the approach (section 3), the delivered proof of concept (section 4), its verification (section 5), and its current limitations and suggested next steps (sections 6 and 7).</w:t>
       </w:r>
     </w:p>
     <w:p>
@@ -272,7 +272,7 @@
         <w:spacing w:after="120"/>
       </w:pPr>
       <w:r>
-        <w:t>An assessing officer needs three numbers for each receptor: the impact of extraction that is already approved, the additional impact attributable to the application in front of them, and the combined total against the trigger threshold. Producing these from a regional model requires re-running large scenarios for every application, and attributing the applicant's share by differencing two large and nearly equal results. Producing them analytically sacrifices the calibrated spatial detail that makes the numbers defensible. GABORA is designed to occupy the gap between these pathways: regional-model fidelity at interactive speed, packaged so that a licensing officer rather than a modeller can run it.</w:t>
+        <w:t>An assessing officer needs three numbers for each receptor: the impact of extraction that is already approved, the additional impact attributable to the application in front of them, and the combined total against the trigger threshold. Producing these from a regional model requires re-running large scenarios for every application, and attributing the applicant's share by differencing two large and nearly equal results. Producing them analytically sacrifices the calibrated spatial detail that makes the numbers defensible. The tool is designed to occupy the gap between these pathways: regional-model fidelity at interactive speed, packaged so that a licensing officer rather than a modeller can run it.</w:t>
       </w:r>
     </w:p>
     <w:p>

</xml_diff>

<commit_message>
PoC overview: enabler statement + future recommendations
- Make explicit that the benefits come from the combination of a
  fast-running tool with a calibrated groundwater model, a significant
  improvement over the Theis-superposition method currently used.
- Recommend fast-running models for the other GAB aquifers in the plan
  area, added to the tool as modules.
- Recommend Monte Carlo simulation across the routinely produced
  calibrated parameter ensembles to quantify uncertainty in the key
  impact metrics; paired with a quantified risk appetite for risk-based
  decisions, with ensembles run cheaply on spot cloud instances.
- New limitation entry: single parameter realisation, forwarded to the
  Monte Carlo recommendation.

Co-Authored-By: Claude Fable 5 <noreply@anthropic.com>
</commit_message>
<xml_diff>
--- a/docs/gabora-poc-overview-draft.docx
+++ b/docs/gabora-poc-overview-draft.docx
@@ -272,7 +272,15 @@
         <w:spacing w:after="120"/>
       </w:pPr>
       <w:r>
-        <w:t>An assessing officer needs three numbers for each receptor: the impact of extraction that is already approved, the additional impact attributable to the application in front of them, and the combined total against the trigger threshold. Producing these from a regional model requires re-running large scenarios for every application, and attributing the applicant's share by differencing two large and nearly equal results. Producing them analytically sacrifices the calibrated spatial detail that makes the numbers defensible. The tool is designed to occupy the gap between these pathways: regional-model fidelity at interactive speed, packaged so that a licensing officer rather than a modeller can run it.</w:t>
+        <w:t>An assessing officer needs three numbers for each receptor: the impact of extraction that is already approved, the additional impact attributable to the application in front of them, and the combined total against the trigger threshold. Producing these from a regional model requires re-running large scenarios for every application, and attributing the applicant's share by differencing two large and nearly equal results. Producing them analytically, as in the superposition of Theis solutions currently used to support assessments, sacrifices the calibrated spatial detail that makes the numbers defensible. The tool is designed to occupy the gap between these pathways: regional-model fidelity at interactive speed, packaged so that a licensing officer rather than a modeller can run it.</w:t>
+      </w:r>
+    </w:p>
+    <w:p>
+      <w:pPr>
+        <w:spacing w:after="120"/>
+      </w:pPr>
+      <w:r>
+        <w:t>The benefits described in this paper are realised by combining two properties that have not previously been available together in the licensing context: a fast-running tool, and one that leverages a calibrated groundwater model. Neither property alone is sufficient. A fast analytical method without the calibrated spatial detail cannot represent aquifer geometry, heterogeneity or boundaries, while a calibrated regional model without interactive speed cannot support assessment at licensing timeframes. Compared to the current practice of superposing Theis solutions, this represents a significant improvement in both the fidelity and the traceability of the impact estimates behind licensing decisions.</w:t>
       </w:r>
     </w:p>
     <w:p>
@@ -777,6 +785,15 @@
         <w:spacing w:after="120"/>
       </w:pPr>
       <w:r>
+        <w:t>Single parameter realisation. The tool currently evaluates one calibrated parameter set, so predictive uncertainty in the impact metrics is not yet quantified. Ensembles of calibrated parameter sets are now routinely produced during model calibration and uncertainty analysis, and section 7 identifies their use in Monte Carlo simulation as a key next step.</w:t>
+      </w:r>
+    </w:p>
+    <w:p>
+      <w:pPr>
+        <w:pStyle w:val="ListBullet"/>
+        <w:spacing w:after="120"/>
+      </w:pPr>
+      <w:r>
         <w:t>Prototype security posture. The login is a mock-up for demonstration; operational deployment would require departmental authentication, hosting and records-management integration.</w:t>
       </w:r>
     </w:p>
@@ -830,7 +847,16 @@
         <w:spacing w:after="120"/>
       </w:pPr>
       <w:r>
-        <w:t>Additional aquifer modules as demand requires.</w:t>
+        <w:t>Development of simple but fast-running models for the other GAB aquifers in the plan area, calibrated or inherited from regional modelling where available, and progressively added to the tool as modules. This would extend the same assessment capability across the plan area and would represent a significant improvement over the superposition of Theis solutions currently used where no regional model product is available.</w:t>
+      </w:r>
+    </w:p>
+    <w:p>
+      <w:pPr>
+        <w:pStyle w:val="ListBullet"/>
+        <w:spacing w:after="120"/>
+      </w:pPr>
+      <w:r>
+        <w:t>Quantification of predictive uncertainty by Monte Carlo simulation. Ensembles of calibrated parameter sets are now routinely obtained as part of model calibration and uncertainty analysis. Running the assessment scenarios across such an ensemble would gauge the uncertainty in the key impact metrics; that uncertainty, together with a quantified risk appetite, would support more informed water management decisions than a single deterministic estimate. The computational cost would be modest: ensemble members are independent and parallelise naturally, and could be run cheaply on transient (spot) cloud computing instances.</w:t>
       </w:r>
     </w:p>
     <w:p>
@@ -847,7 +873,7 @@
         <w:spacing w:after="120"/>
       </w:pPr>
       <w:r>
-        <w:t>A working proof of concept demonstrates that licence-application impact assessment can be performed at interactive speed while remaining consistent with OGIA's calibrated regional modelling.</w:t>
+        <w:t>A working proof of concept demonstrates that licence-application impact assessment can be performed at interactive speed while remaining consistent with OGIA's calibrated regional modelling. The combination of a fast-running tool with a calibrated model is what realises the benefits, and is a significant improvement over the superposition of Theis solutions currently used to support assessments.</w:t>
       </w:r>
     </w:p>
     <w:p>
@@ -884,6 +910,15 @@
       </w:pPr>
       <w:r>
         <w:t>Known limitations are bounded and reported by the tool itself; the suggested next steps (section 7) address them in order of consequence.</w:t>
+      </w:r>
+    </w:p>
+    <w:p>
+      <w:pPr>
+        <w:pStyle w:val="ListBullet"/>
+        <w:spacing w:after="120"/>
+      </w:pPr>
+      <w:r>
+        <w:t>The most consequential extensions are fast-running models for the remaining GAB aquifers in the plan area, and Monte Carlo simulation across the routinely produced calibrated parameter ensembles so that impact metrics carry quantified uncertainty for risk-based decision making.</w:t>
       </w:r>
     </w:p>
     <w:p>

</xml_diff>

<commit_message>
PoC overview: expand decision tracking section
Describe the event-sourced register properly: per-event officer
attribution, reason note, scenario change set and provenance hashes;
rollbacks as recorded events; statuses derived by replaying history so
nothing is rewritten or deleted; durable storage. State plainly that
approved decisions do not yet feed back into the modelled baseline, and
add that integration as a next step.

Co-Authored-By: Claude Fable 5 <noreply@anthropic.com>
</commit_message>
<xml_diff>
--- a/docs/gabora-poc-overview-draft.docx
+++ b/docs/gabora-poc-overview-draft.docx
@@ -682,7 +682,7 @@
         <w:pStyle w:val="Heading2"/>
       </w:pPr>
       <w:r>
-        <w:t>4.3  Auditability and provenance</w:t>
+        <w:t>4.3  Decision tracking and provenance</w:t>
       </w:r>
     </w:p>
     <w:p>
@@ -690,7 +690,15 @@
         <w:spacing w:after="120"/>
       </w:pPr>
       <w:r>
-        <w:t>Approve and reject decisions are recorded in an append-only register together with the scenario definition, the headline results, hashes of the configuration and input datasets, and the model version. Every number in an assessment can consequently be reproduced later from its recorded provenance. This is intended to support the defensibility of decisions informed by the tool.</w:t>
+        <w:t>Every approve or reject decision is recorded as an event in an append-only register, together with the officer's name, a free-text reason, the timestamp, the full scenario change set, the headline results, hashes of the configuration and input datasets, and the model version. Rollbacks are themselves recorded events attributed to a named officer; the current status of each decision (active, rolled back or rejected) is derived by replaying the event history, so nothing is ever rewritten or deleted. Because the full scenario definition travels with each event, any past decision can be re-run and its numbers reproduced exactly from the recorded provenance. The register is stored as durable runtime data, separate from regenerable model outputs, and is intended to support internal review, audit and information-access processes.</w:t>
+      </w:r>
+    </w:p>
+    <w:p>
+      <w:pPr>
+        <w:spacing w:after="120"/>
+      </w:pPr>
+      <w:r>
+        <w:t>In the proof of concept the register is a record of decisions rather than an input to the modelling: extraction approved through the tool is not yet fed back into the cached baseline, which continues to reflect the ingested water-use dataset. The event format already carries the information needed for that integration, which is identified as a next step (section 7).</w:t>
       </w:r>
     </w:p>
     <w:p>
@@ -839,6 +847,15 @@
       </w:pPr>
       <w:r>
         <w:t>Production hardening: authentication, hosting, records integration, and a data refresh pathway for each new UWIR and water-use dataset.</w:t>
+      </w:r>
+    </w:p>
+    <w:p>
+      <w:pPr>
+        <w:pStyle w:val="ListBullet"/>
+        <w:spacing w:after="120"/>
+      </w:pPr>
+      <w:r>
+        <w:t>Integration of the decision register with the modelled baseline, so that extraction approved through the tool is reflected in the approved-take layer of subsequent assessments within a licensing cycle. The event format already records the required change sets.</w:t>
       </w:r>
     </w:p>
     <w:p>

</xml_diff>

<commit_message>
PoC overview: correct current-practice framing and parent-model context
- Current GAB licence assessments do not run numerical groundwater
  models: impacts are estimated by Theis superposition, and other
  sources of impact such as S&D take are not accounted for. The tool
  represents all recorded extraction and reports S&D separately.
- The regional model was built for CSG impact assessment; because it
  also simulates non-CSG abstraction it is a natural fit for the
  licensing problem, and its run-time barrier is bypassed by
  reconstructing fast single-layer models from it.
- Acronyms re-deduplicated after the reordering.

Co-Authored-By: Claude Fable 5 <noreply@anthropic.com>
</commit_message>
<xml_diff>
--- a/docs/gabora-poc-overview-draft.docx
+++ b/docs/gabora-poc-overview-draft.docx
@@ -232,7 +232,7 @@
         <w:spacing w:after="120"/>
       </w:pPr>
       <w:r>
-        <w:t>When a water licence application is assessed, the material question is not only what the proposed bore will do, but what it will do in addition to the extraction that is already approved. Answering that question defensibly in GAB aquifers has generally required either a scenario run of a regional groundwater model, which is rigorous but requires specialist modellers and turnaround times measured in weeks, or a simplified analytical calculation, which is fast but does not represent aquifer geometry, spatially variable properties, boundaries or recharge, and is difficult to reconcile with regional model predictions.</w:t>
+        <w:t>When a water licence application is assessed, the material question is not only what the proposed bore will do, but what it will do in addition to the extraction that is already occurring. Numerical groundwater models are not currently run for GAB licence assessments: impacts are estimated by superposition of the Theis analytical solution. That method is fast, but it cannot represent aquifer geometry, spatially variable properties, boundaries or recharge, and the assessment does not generally account for other sources of impact such as stock and domestic (S&amp;D) take alongside licensed extraction.</w:t>
       </w:r>
     </w:p>
     <w:p>
@@ -240,7 +240,7 @@
         <w:spacing w:after="120"/>
       </w:pPr>
       <w:r>
-        <w:t>The Office of Groundwater Impact Assessment (OGIA) maintains the calibrated regional model that underpins the Underground Water Impact Report (UWIR) for the Surat Cumulative Management Area (OGIA 2025). That model is the State's established representation of the flow system. A licensing tool that is consistent with it, rather than parallel to it, avoids introducing a second and potentially conflicting basis for impact predictions.</w:t>
+        <w:t>A calibrated numerical representation of the system does exist. The Office of Groundwater Impact Assessment (OGIA) maintains the regional model that underpins the Underground Water Impact Report (UWIR) for the Surat Cumulative Management Area (OGIA 2025). That model was built to assess the impacts of coal seam gas (CSG) development; because it also simulates non-CSG abstraction, it is a natural fit for the licence assessment problem. What has prevented its direct use in licensing is run time: full regional scenarios are impractical at licensing timeframes. A licensing tool that is consistent with the regional model, rather than parallel to it, also avoids introducing a second and potentially conflicting basis for impact predictions.</w:t>
       </w:r>
     </w:p>
     <w:p>
@@ -272,7 +272,7 @@
         <w:spacing w:after="120"/>
       </w:pPr>
       <w:r>
-        <w:t>An assessing officer needs three numbers for each receptor: the impact of extraction that is already approved, the additional impact attributable to the application in front of them, and the combined total against the trigger threshold. Producing these from a regional model requires re-running large scenarios for every application, and attributing the applicant's share by differencing two large and nearly equal results. Producing them analytically, as in the superposition of Theis solutions currently used to support assessments, sacrifices the calibrated spatial detail that makes the numbers defensible. The tool is designed to occupy the gap between these pathways: regional-model fidelity at interactive speed, packaged so that a licensing officer rather than a modeller can run it.</w:t>
+        <w:t>An assessing officer needs three numbers for each receptor: the impact of extraction that is already occurring, the additional impact attributable to the application in front of them, and the combined total against the trigger threshold. The current Theis-based method estimates the additional impact of the application, but without the calibrated spatial detail that makes the number defensible, and without the cumulative context, since other sources of impact such as S&amp;D take are not accounted for. Using the regional model directly would supply both, but would require re-running large scenarios for every application at impractical run times, with the applicant's share attributed by differencing two large and nearly equal results. The tool bypasses the run-time barrier by reconstructing fast single-layer models from the calibrated regional model (section 3.1), giving regional-model fidelity at interactive speed, packaged so that a licensing officer rather than a modeller can run it. It also represents all recorded extraction, including S&amp;D take, and reports its contribution separately from licensed entitlement take.</w:t>
       </w:r>
     </w:p>
     <w:p>
@@ -280,7 +280,7 @@
         <w:spacing w:after="120"/>
       </w:pPr>
       <w:r>
-        <w:t>The benefits described in this paper are realised by combining two properties that have not previously been available together in the licensing context: a fast-running tool, and one that leverages a calibrated groundwater model. Neither property alone is sufficient. A fast analytical method without the calibrated spatial detail cannot represent aquifer geometry, heterogeneity or boundaries, while a calibrated regional model without interactive speed cannot support assessment at licensing timeframes. Compared to the current practice of superposing Theis solutions, this represents a significant improvement in both the fidelity and the traceability of the impact estimates behind licensing decisions.</w:t>
+        <w:t>The benefits described in this paper are therefore realised by combining two properties that have not previously been available together in the licensing context: a fast-running tool, and one that leverages a calibrated groundwater model. Neither property alone is sufficient. A fast analytical method without the calibrated spatial detail cannot represent aquifer geometry, heterogeneity or boundaries, while a calibrated regional model without interactive speed cannot support assessment at licensing timeframes. Compared to the current practice of superposing Theis solutions, this represents a significant improvement in the fidelity, completeness and traceability of the impact estimates behind licensing decisions.</w:t>
       </w:r>
     </w:p>
     <w:p>
@@ -304,7 +304,7 @@
         <w:spacing w:after="120"/>
       </w:pPr>
       <w:r>
-        <w:t>Each aquifer is represented as a single-layer MODFLOW 6 model (Langevin et al 2017) whose grid, hydraulic properties, recharge, boundary conditions and spring-discharge cells are extracted directly from OGIA's UWIR 2025 regional model. The tool does not introduce a new conceptualisation and it has not been separately calibrated; it carries the regional model's calibrated parameters into a faster, single-aquifer frame. Impact predictions are therefore traceable to the same calibrated property fields that support the UWIR, which is the principal basis of the tool's defensibility.</w:t>
+        <w:t>Each aquifer is represented as a single-layer MODFLOW 6 model (Langevin et al 2017) whose grid, hydraulic properties, recharge, boundary conditions and spring-discharge cells are extracted directly from OGIA's UWIR 2025 regional model. Although that model was built for CSG impact assessment, it simulates non-CSG abstraction as part of the same system, so its calibrated representation transfers naturally to the licensing problem; the single-layer reconstruction is what removes its run-time barrier. The tool does not introduce a new conceptualisation and it has not been separately calibrated; it carries the regional model's calibrated parameters into a faster, single-aquifer frame. Impact predictions are therefore traceable to the same calibrated property fields that support the UWIR, which is the principal basis of the tool's defensibility.</w:t>
       </w:r>
     </w:p>
     <w:p>
@@ -376,7 +376,7 @@
         <w:spacing w:after="120"/>
       </w:pPr>
       <w:r>
-        <w:t>Results are reported per spring complex and per output year in four layers: the impact of all currently approved extraction (approved), the subset of that impact attributable to entitlement holders (licensed), the impact of the proposed change alone (additional), and their combined total. The default trigger threshold is 0.4 m, the water bore threshold; this is deliberately distinct from the 0.2 m spring threshold that applies to coal seam gas (CSG) assessments under the UWIR. Each complex is classified as already exceeding the threshold from approved take, which is advisory and not attributable to the applicant, or as triggered by the proposal, which is the decision-relevant case. The spring complex is the unit of analysis, and the worst-affected member spring sets the complex's reported drawdown, which is the conservative choice for trigger reporting.</w:t>
+        <w:t>Results are reported per spring complex and per output year in four layers: the impact of all currently approved extraction (approved), the subset of that impact attributable to entitlement holders (licensed), the impact of the proposed change alone (additional), and their combined total. The default trigger threshold is 0.4 m, the water bore threshold; this is deliberately distinct from the 0.2 m spring threshold that applies to CSG assessments under the UWIR. Each complex is classified as already exceeding the threshold from approved take, which is advisory and not attributable to the applicant, or as triggered by the proposal, which is the decision-relevant case. The spring complex is the unit of analysis, and the worst-affected member spring sets the complex's reported drawdown, which is the conservative choice for trigger reporting.</w:t>
       </w:r>
     </w:p>
     <w:p>
@@ -400,7 +400,7 @@
         <w:spacing w:after="120"/>
       </w:pPr>
       <w:r>
-        <w:t>Three aquifers are currently live as independent modules: the Precipice Sandstone, the Hutton Sandstone and the Gubberamunda Sandstone. Each module carries its own configuration, extracted datasets and cached baseline. Current extraction represented in the modules, from the 2024 OGIA water-use dataset, is summarised in Table 1. In total the three modules represent about 6,700 bores and around 37,500 ML/year of take, of which about 74% is licensed entitlement take and the remainder is stock and domestic (S&amp;D) use.</w:t>
+        <w:t>Three aquifers are currently live as independent modules: the Precipice Sandstone, the Hutton Sandstone and the Gubberamunda Sandstone. Each module carries its own configuration, extracted datasets and cached baseline. Current extraction represented in the modules, from the 2024 OGIA water-use dataset, is summarised in Table 1. In total the three modules represent about 6,700 bores and around 37,500 ML/year of take, of which about 74% is licensed entitlement take and the remainder is S&amp;D use.</w:t>
       </w:r>
     </w:p>
     <w:p>

</xml_diff>

<commit_message>
Rebuild PoC overview docx from the revised markdown
Carries the contributor and language revisions (d676a33, 0af6425)
into the Word version so the pair stays in sync.

Co-Authored-By: Claude Fable 5 <noreply@anthropic.com>
</commit_message>
<xml_diff>
--- a/docs/gabora-poc-overview-draft.docx
+++ b/docs/gabora-poc-overview-draft.docx
@@ -56,18 +56,7 @@
         <w:rPr>
           <w:sz w:val="18"/>
         </w:rPr>
-        <w:t>Citation: X (2026), A proof-of-concept tool for cumulative impact assessment of water licence applications in the GABORA water plan area. A proof-of-concept overview, Department of Local Government, Water and Volunteers, Queensland Government, Australia. August 2026.</w:t>
-      </w:r>
-    </w:p>
-    <w:p>
-      <w:pPr>
-        <w:spacing w:after="120"/>
-      </w:pPr>
-      <w:r>
-        <w:rPr>
-          <w:sz w:val="18"/>
-        </w:rPr>
-        <w:t>Contributors: [to be confirmed]</w:t>
+        <w:t>Contributors: Gerhard Schöning</w:t>
       </w:r>
     </w:p>
     <w:p>
@@ -96,7 +85,7 @@
         <w:spacing w:after="120"/>
       </w:pPr>
       <w:r>
-        <w:t>This overview is prepared for departmental officers involved in water licensing and groundwater assessment, and for technical reviewers of the proof of concept. A basic understanding of Great Artesian Basin (GAB) hydrogeology and of groundwater licensing in Queensland is implied. This paper summarises the approach and its benefits; the full technical detail, configuration and test suite sit with the tool's repository documentation.</w:t>
+        <w:t>This overview is prepared for departmental officers involved in water licensing and groundwater assessment. A basic understanding of Great Artesian Basin (GAB) hydrogeology and of groundwater licensing in Queensland is implied. This paper summarises the approach and its benefits; the full technical detail, configuration and test suite sit with the tool's repository documentation.</w:t>
       </w:r>
     </w:p>
     <w:p>
@@ -152,7 +141,7 @@
         <w:spacing w:after="120"/>
       </w:pPr>
       <w:r>
-        <w:t>An assessing officer needs three numbers for each receptor: the impact of extraction that is already occurring, the additional impact attributable to the application in front of them, and the combined total against the trigger threshold. The current Theis-based method estimates the additional impact of the application, but without the calibrated spatial detail that makes the number defensible, and without the cumulative context, since other sources of impact such as S&amp;D take are not accounted for. Using the regional model directly would supply both, but would require re-running large scenarios for every application at impractical run times, with the applicant's share attributed by differencing two large and nearly equal results. The tool bypasses the run-time barrier by reconstructing fast single-layer models from the calibrated regional model (section 3.1), giving regional-model fidelity at interactive speed, packaged so that a licensing officer rather than a modeller can run it. It also represents all recorded extraction, including S&amp;D take, and reports its contribution separately from licensed entitlement take.</w:t>
+        <w:t>An assessing officer requires three numbers for each receptor: the impact of extraction that is already occurring, the additional impact attributable to the application in front of them, and the combined total against the trigger threshold. The current Theis-based method estimates the additional impact of the application, but without the calibrated spatial detail that makes the number defensible, and without the cumulative context, since other sources of impact such as S&amp;D take are not accounted for. Using the regional model directly would supply both, but would require re-running large scenarios for every application at impractical run times, with the applicant's share attributed by differencing two large and nearly equal results. The tool bypasses the run-time barrier by reconstructing fast single-layer models from the calibrated regional model (section 3.1), giving regional-model fidelity at interactive speed, packaged so that a licensing officer rather than a modeller can run it. It also represents all recorded extraction, including S&amp;D take, and reports its contribution separately from licensed entitlement take.</w:t>
       </w:r>
     </w:p>
     <w:p>
@@ -208,7 +197,7 @@
         <w:spacing w:after="120"/>
       </w:pPr>
       <w:r>
-        <w:t>The near-linearity that this design exploits is verified rather than assumed. For the linear configuration the automated test suite confirms that a directly modelled combined scenario matches the sum of separately modelled scenarios to solver precision, with differences of the order of 10-9 m. Where the head-dependent spring discharge described in section 3.4 responds to pumping, the combined scenario is deliberately modelled directly, because simple addition of separate runs would understate the impact there (section 5).</w:t>
+        <w:t>The near-linearity that this design exploits is verified. For the linear configuration the automated test suite confirms that a directly modelled combined scenario matches the sum of separately modelled scenarios to solver precision, with differences of the order of 10-9 m. Where the head-dependent spring discharge described in section 3.4 responds to pumping, the combined scenario is deliberately modelled directly, because simple addition of separate runs would understate the impact there (section 5).</w:t>
       </w:r>
     </w:p>
     <w:p>

</xml_diff>